<commit_message>
M18 T7+T7b: sync docx overview wording; regenerate HSUM artifacts
Street opioids label, Goose bumps, other-drug SUD01 typo repair in the
overview matrix; prebuilt DOCX/REDCap artifacts rebuilt from the
corrected generators (qualtrics .qsf is hand-built and still stale).

Co-Authored-By: Claude Fable 5 <noreply@anthropic.com>
</commit_message>
<xml_diff>
--- a/inst/extdata/hitophsum_1.0_A4.docx
+++ b/inst/extdata/hitophsum_1.0_A4.docx
@@ -591,7 +591,7 @@
                 <w:szCs w:val="20"/>
                 <w:color w:val="000000"/>
               </w:rPr>
-              <w:t xml:space="preserve">• Heroin/opiates (heroin, opium, fentanyl, etc.)</w:t>
+              <w:t xml:space="preserve">• Street opioids (heroin, opium, fentanyl, etc.)</w:t>
             </w:r>
             <w:r>
               <w:rPr>
@@ -3825,7 +3825,7 @@
                 <w:szCs w:val="20"/>
                 <w:color w:val="000000"/>
               </w:rPr>
-              <w:t xml:space="preserve">Reminders of [substance] gave me a strong urge to drink.</w:t>
+              <w:t xml:space="preserve">Reminders of [substance] gave me a strong urge to use [substance].</w:t>
             </w:r>
           </w:p>
         </w:tc>
@@ -8677,7 +8677,7 @@
                 <w:szCs w:val="20"/>
                 <w:color w:val="000000"/>
               </w:rPr>
-              <w:t xml:space="preserve">Goosebumps</w:t>
+              <w:t xml:space="preserve">Goose bumps</w:t>
             </w:r>
           </w:p>
         </w:tc>

</xml_diff>

<commit_message>
HiTOP-HSUM source alignment (revised SUD module, August 2024) (#20)
Aligns hitophsum_items/hitophsum_choices and the HSUM DOCX/REDCap generators to the authoritative 'revised SUD module-August 2024' sheet: 66 item text/gate corrections, valid cigar-quantity dropdown, PNTS gate guards, new other_drug_rule argument (most_frequent default / per_drug opt-out), docx wording sync, regenerated artifacts, full provenance in cairn/SOURCES.md (D-014). Merged with Jeff's explicit keying sign-off.
</commit_message>
<xml_diff>
--- a/inst/extdata/hitophsum_1.0_A4.docx
+++ b/inst/extdata/hitophsum_1.0_A4.docx
@@ -591,7 +591,7 @@
                 <w:szCs w:val="20"/>
                 <w:color w:val="000000"/>
               </w:rPr>
-              <w:t xml:space="preserve">• Heroin/opiates (heroin, opium, fentanyl, etc.)</w:t>
+              <w:t xml:space="preserve">• Street opioids (heroin, opium, fentanyl, etc.)</w:t>
             </w:r>
             <w:r>
               <w:rPr>
@@ -3825,7 +3825,7 @@
                 <w:szCs w:val="20"/>
                 <w:color w:val="000000"/>
               </w:rPr>
-              <w:t xml:space="preserve">Reminders of [substance] gave me a strong urge to drink.</w:t>
+              <w:t xml:space="preserve">Reminders of [substance] gave me a strong urge to use [substance].</w:t>
             </w:r>
           </w:p>
         </w:tc>
@@ -8677,7 +8677,7 @@
                 <w:szCs w:val="20"/>
                 <w:color w:val="000000"/>
               </w:rPr>
-              <w:t xml:space="preserve">Goosebumps</w:t>
+              <w:t xml:space="preserve">Goose bumps</w:t>
             </w:r>
           </w:p>
         </w:tc>

</xml_diff>